<commit_message>
add next semester discipline folders
</commit_message>
<xml_diff>
--- a/BZ_KNT-122_Onyshchenko_19_PR.docx
+++ b/BZ_KNT-122_Onyshchenko_19_PR.docx
@@ -533,7 +533,7 @@
     </w:p>
     <w:p>
       <w:pPr>
-        <w:pStyle w:val="img11"/>
+        <w:pStyle w:val="img1"/>
         <w:rPr>
           <w:lang w:val="en-US"/>
         </w:rPr>
@@ -546,16 +546,16 @@
     </w:p>
     <w:p>
       <w:pPr>
-        <w:pStyle w:val="img11"/>
-        <w:rPr/>
-      </w:pPr>
-      <w:r>
-        <w:rPr/>
-      </w:r>
-    </w:p>
-    <w:p>
-      <w:pPr>
-        <w:pStyle w:val="img11"/>
+        <w:pStyle w:val="img1"/>
+        <w:rPr/>
+      </w:pPr>
+      <w:r>
+        <w:rPr/>
+      </w:r>
+    </w:p>
+    <w:p>
+      <w:pPr>
+        <w:pStyle w:val="img1"/>
         <w:rPr/>
       </w:pPr>
       <w:r>
@@ -579,11 +579,7 @@
       </w:pPr>
       <w:r>
         <w:rPr/>
-        <w:t>П</w:t>
-      </w:r>
-      <w:r>
-        <w:rPr/>
-        <w:t>итання</w:t>
+        <w:t>Питання</w:t>
       </w:r>
     </w:p>
     <w:p>
@@ -1376,7 +1372,6 @@
   <w:style w:type="character" w:styleId="H1Char" w:customStyle="1">
     <w:name w:val="H1 Char"/>
     <w:basedOn w:val="1"/>
-    <w:link w:val="H1"/>
     <w:qFormat/>
     <w:rsid w:val="00e9279b"/>
     <w:rPr>
@@ -1511,7 +1506,6 @@
   <w:style w:type="character" w:styleId="IMG" w:customStyle="1">
     <w:name w:val="IMG Знак"/>
     <w:basedOn w:val="P"/>
-    <w:link w:val="IMG1"/>
     <w:qFormat/>
     <w:rsid w:val="007e21e3"/>
     <w:rPr>
@@ -1644,12 +1638,12 @@
       <w:lang w:val="en-US" w:eastAsia="uk-UA"/>
     </w:rPr>
   </w:style>
-  <w:style w:type="character" w:styleId="Style12">
-    <w:name w:val="Символ нумерації"/>
+  <w:style w:type="character" w:styleId="user">
+    <w:name w:val="Символ нумерації (user)"/>
     <w:qFormat/>
     <w:rPr/>
   </w:style>
-  <w:style w:type="paragraph" w:styleId="Style13">
+  <w:style w:type="paragraph" w:styleId="Style12">
     <w:name w:val="Заголовок"/>
     <w:basedOn w:val="Normal"/>
     <w:next w:val="BodyText"/>
@@ -1659,7 +1653,7 @@
       <w:spacing w:before="240" w:after="120"/>
     </w:pPr>
     <w:rPr>
-      <w:rFonts w:ascii="Liberation Sans" w:hAnsi="Liberation Sans" w:eastAsia="Microsoft YaHei" w:cs="Lucida Sans"/>
+      <w:rFonts w:ascii="Liberation Sans" w:hAnsi="Liberation Sans" w:eastAsia="Microsoft YaHei" w:cs="Arial Unicode MS"/>
       <w:sz w:val="28"/>
       <w:szCs w:val="28"/>
     </w:rPr>
@@ -1696,7 +1690,7 @@
       <w:szCs w:val="24"/>
     </w:rPr>
   </w:style>
-  <w:style w:type="paragraph" w:styleId="Style14">
+  <w:style w:type="paragraph" w:styleId="Style13">
     <w:name w:val="Покажчик"/>
     <w:basedOn w:val="Normal"/>
     <w:qFormat/>
@@ -1704,10 +1698,10 @@
       <w:suppressLineNumbers/>
     </w:pPr>
     <w:rPr>
-      <w:rFonts w:cs="Lucida Sans"/>
-    </w:rPr>
-  </w:style>
-  <w:style w:type="paragraph" w:styleId="user">
+      <w:rFonts w:cs="Arial Unicode MS"/>
+    </w:rPr>
+  </w:style>
+  <w:style w:type="paragraph" w:styleId="user1">
     <w:name w:val="Заголовок (user)"/>
     <w:basedOn w:val="Normal"/>
     <w:next w:val="BodyText"/>
@@ -1717,12 +1711,12 @@
       <w:spacing w:before="240" w:after="120"/>
     </w:pPr>
     <w:rPr>
-      <w:rFonts w:ascii="Liberation Sans" w:hAnsi="Liberation Sans" w:eastAsia="Microsoft YaHei" w:cs="Arial Unicode MS"/>
+      <w:rFonts w:ascii="Liberation Sans" w:hAnsi="Liberation Sans" w:eastAsia="Microsoft YaHei" w:cs="Lucida Sans"/>
       <w:sz w:val="28"/>
       <w:szCs w:val="28"/>
     </w:rPr>
   </w:style>
-  <w:style w:type="paragraph" w:styleId="user1">
+  <w:style w:type="paragraph" w:styleId="user2">
     <w:name w:val="Покажчик (user)"/>
     <w:basedOn w:val="Normal"/>
     <w:qFormat/>
@@ -1730,12 +1724,12 @@
       <w:suppressLineNumbers/>
     </w:pPr>
     <w:rPr>
-      <w:rFonts w:cs="Arial Unicode MS"/>
+      <w:rFonts w:cs="Lucida Sans"/>
     </w:rPr>
   </w:style>
   <w:style w:type="paragraph" w:styleId="IndexHeading">
     <w:name w:val="index heading"/>
-    <w:basedOn w:val="user"/>
+    <w:basedOn w:val="Style12"/>
     <w:pPr/>
     <w:rPr/>
   </w:style>
@@ -1806,27 +1800,6 @@
       <w:szCs w:val="22"/>
     </w:rPr>
   </w:style>
-  <w:style w:type="paragraph" w:styleId="H1" w:customStyle="1">
-    <w:name w:val="H1"/>
-    <w:basedOn w:val="Heading1"/>
-    <w:next w:val="P1"/>
-    <w:link w:val="H1Char"/>
-    <w:qFormat/>
-    <w:rsid w:val="00e9279b"/>
-    <w:pPr>
-      <w:ind w:firstLine="850"/>
-      <w:jc w:val="left"/>
-    </w:pPr>
-    <w:rPr>
-      <w:rFonts w:ascii="Times New Roman" w:hAnsi="Times New Roman" w:cs="Times New Roman"/>
-      <w:b/>
-      <w:bCs/>
-      <w:smallCaps/>
-      <w:color w:themeColor="text1" w:val="000000"/>
-      <w:sz w:val="28"/>
-      <w:szCs w:val="28"/>
-    </w:rPr>
-  </w:style>
   <w:style w:type="paragraph" w:styleId="H2" w:customStyle="1">
     <w:name w:val="H2"/>
     <w:basedOn w:val="Heading2"/>
@@ -1899,18 +1872,6 @@
     <w:rsid w:val="00375986"/>
     <w:pPr>
       <w:outlineLvl w:val="3"/>
-    </w:pPr>
-    <w:rPr/>
-  </w:style>
-  <w:style w:type="paragraph" w:styleId="IMG1" w:customStyle="1">
-    <w:name w:val="IMG"/>
-    <w:basedOn w:val="P1"/>
-    <w:link w:val="IMG"/>
-    <w:qFormat/>
-    <w:rsid w:val="007e21e3"/>
-    <w:pPr>
-      <w:ind w:hanging="0"/>
-      <w:jc w:val="center"/>
     </w:pPr>
     <w:rPr/>
   </w:style>
@@ -2019,17 +1980,18 @@
     <w:qFormat/>
     <w:pPr>
       <w:spacing w:lineRule="auto" w:line="360" w:before="0" w:after="0"/>
-      <w:ind w:firstLine="851"/>
+      <w:ind w:hanging="0"/>
+      <w:jc w:val="center"/>
     </w:pPr>
     <w:rPr>
       <w:rFonts w:ascii="Times New Roman" w:hAnsi="Times New Roman"/>
       <w:b/>
-      <w:smallCaps/>
+      <w:caps/>
       <w:color w:val="auto"/>
       <w:sz w:val="28"/>
     </w:rPr>
   </w:style>
-  <w:style w:type="paragraph" w:styleId="img11">
+  <w:style w:type="paragraph" w:styleId="img1">
     <w:name w:val="img1"/>
     <w:basedOn w:val="p11"/>
     <w:next w:val="p11"/>
@@ -2040,8 +2002,8 @@
     </w:pPr>
     <w:rPr/>
   </w:style>
-  <w:style w:type="numbering" w:styleId="user2" w:default="1">
-    <w:name w:val="Без маркерів (user)"/>
+  <w:style w:type="numbering" w:styleId="Style14" w:default="1">
+    <w:name w:val="Без маркерів"/>
     <w:uiPriority w:val="99"/>
     <w:semiHidden/>
     <w:unhideWhenUsed/>

</xml_diff>